<commit_message>
Updated Word legislation overview notes
</commit_message>
<xml_diff>
--- a/State_Election_Info/Draft_Legislation/Co-Judge_Reconciliation_Bill/Election_Code_Ch67_Ch127_Markup.docx
+++ b/State_Election_Info/Draft_Legislation/Co-Judge_Reconciliation_Bill/Election_Code_Ch67_Ch127_Markup.docx
@@ -64,105 +64,6 @@
       </w:pPr>
       <w:r>
         <w:t xml:space="preserve">Sections shown: Section 67.003 (time for local canvass, new Subsection (d)); Section 67.004 (procedure for local canvass, new Subsections (h) through (j)); and Chapter 127, Subchapter J (shown for placement) followed by new Subchapter K, Sections 127.401 through 127.431. Other chapters the bill refers to (65, 66, 87, 129, 213, 273) are cross-referenced but not amended.</w:t>
-      </w:r>
-    </w:p>
-    <w:p>
-      <w:pPr>
-        <w:pStyle w:val="Heading1"/>
-      </w:pPr>
-      <w:r>
-        <w:t xml:space="preserve">Where the current text differs from what the draft assumed</w:t>
-      </w:r>
-    </w:p>
-    <w:p>
-      <w:pPr>
-        <w:pStyle w:val="ListParagraph"/>
-        <w:numPr>
-          <w:ilvl w:val="0"/>
-          <w:numId w:val="2"/>
-        </w:numPr>
-        <w:spacing w:after="80"/>
-      </w:pPr>
-      <w:r>
-        <w:t xml:space="preserve">Section 127.201(b-2), added by S.B. 827 (2025): in an election with a statewide risk-limiting audit, the hand count may not begin until the Secretary of State certifies the audit complete, and it may run to the 30th day after election day or a later deadline set by the Secretary. The draft assumed the hand count could usually finish before the canvass. Sections 127.410(d) and 127.418(d) have been conformed: in those elections the hand-count comparison goes into the supplemental report, which is now due by the later of the 45th day or 15 days after the hand count ends.</w:t>
-      </w:r>
-    </w:p>
-    <w:p>
-      <w:pPr>
-        <w:pStyle w:val="ListParagraph"/>
-        <w:numPr>
-          <w:ilvl w:val="0"/>
-          <w:numId w:val="2"/>
-        </w:numPr>
-        <w:spacing w:after="80"/>
-      </w:pPr>
-      <w:r>
-        <w:t xml:space="preserve">Section 127.201(b-1): the early voting ballot board performs the hand count at the custodian's direction. That fits the bill (co-judges observe it under Section 127.408(a)(7)) and needs no change.</w:t>
-      </w:r>
-    </w:p>
-    <w:p>
-      <w:pPr>
-        <w:pStyle w:val="ListParagraph"/>
-        <w:numPr>
-          <w:ilvl w:val="0"/>
-          <w:numId w:val="2"/>
-        </w:numPr>
-        <w:spacing w:after="80"/>
-      </w:pPr>
-      <w:r>
-        <w:t xml:space="preserve">Section 66.058(b-1): voted-ballot containers may not be opened "except as permitted by this code." The draft's "notwithstanding Section 66.058" clause now cites Subsection (b-1) specifically, and no amendment to Section 66.058 is needed.</w:t>
-      </w:r>
-    </w:p>
-    <w:p>
-      <w:pPr>
-        <w:pStyle w:val="ListParagraph"/>
-        <w:numPr>
-          <w:ilvl w:val="0"/>
-          <w:numId w:val="2"/>
-        </w:numPr>
-        <w:spacing w:after="80"/>
-      </w:pPr>
-      <w:r>
-        <w:t xml:space="preserve">Section 127.093(d), amended in 2025: central counting equipment must be tested immediately after each count. This supports the bill's re-acceptance path (Section 127.423) and needs no change.</w:t>
-      </w:r>
-    </w:p>
-    <w:p>
-      <w:pPr>
-        <w:pStyle w:val="ListParagraph"/>
-        <w:numPr>
-          <w:ilvl w:val="0"/>
-          <w:numId w:val="2"/>
-        </w:numPr>
-        <w:spacing w:after="80"/>
-      </w:pPr>
-      <w:r>
-        <w:t xml:space="preserve">Section 129.023(c-2) defines the "representative sample" for L&amp;A hash validation as ten devices or five percent of each type, whichever is fewer. The bill's integrity examination goes further (all EMS and central tabulators, plus a random sample), consistent with the draft.</w:t>
-      </w:r>
-    </w:p>
-    <w:p>
-      <w:pPr>
-        <w:pStyle w:val="ListParagraph"/>
-        <w:numPr>
-          <w:ilvl w:val="0"/>
-          <w:numId w:val="2"/>
-        </w:numPr>
-        <w:spacing w:after="80"/>
-      </w:pPr>
-      <w:r>
-        <w:t xml:space="preserve">Section 1.006(b): when a deadline falls on a weekend or holiday and is extended, dependent dates move with it. The examination closing date in Section 127.418 is tied to the last canvass day, so it moves too. No change is needed, but sponsors should know.</w:t>
-      </w:r>
-    </w:p>
-    <w:p>
-      <w:pPr>
-        <w:pStyle w:val="ListParagraph"/>
-        <w:numPr>
-          <w:ilvl w:val="0"/>
-          <w:numId w:val="2"/>
-        </w:numPr>
-        <w:spacing w:after="80"/>
-      </w:pPr>
-      <w:r>
-        <w:t xml:space="preserve">Confirmed as assumed: Section 67.003 has no Subsection (a) (repealed in 2017); Section 67.004 runs through Subsection (g); Chapter 127 ends with Subchapter J, Section 127.351; Section 127.005(e) pairs central-counting-station judges only in elections with judges appointed under Section 32.002; Sections 87.002(d), 87.027(i)-(j), and 273.061 read as the bill describes.</w:t>
       </w:r>
     </w:p>
     <w:p>
@@ -4238,12 +4139,6 @@
   </w:abstractNum>
   <w:num w:numId="1">
     <w:abstractNumId w:val="1"/>
-    <w:lvlOverride w:ilvl="0">
-      <w:startOverride w:val="1"/>
-    </w:lvlOverride>
-  </w:num>
-  <w:num w:numId="2">
-    <w:abstractNumId w:val="2"/>
     <w:lvlOverride w:ilvl="0">
       <w:startOverride w:val="1"/>
     </w:lvlOverride>

</xml_diff>